<commit_message>
Manuscript: add experimental-comparison section + workshop benchmark grid
(a) nuclear_stopping_paper_draft.{md,docx}: new section F folding in the four
    recent-measurement comparisons (Malko, Cayzac, Zylstra, Frenje), led by the
    Frenje 2019 nuclear-elastic result (model nuclear/ion = 23% at vi~0.3 v_th,
    matching the ~20% Frenje attributes to that channel). docx now embeds Figs
    6-8 (exp_compare_icf, exp_compare, exp_bench); 102 paragraphs, validated.
(b) bench_workshop.py + exp_bench figure/table: model run across the Stanek 2024
    workshop benchmark cases (alpha electronic stopping for H1/C1/Be1/Al1/Cu1),
    tabulated peak Se and Se(vp=2 a.u.) for overlay against the workshop consensus.

Co-Authored-By: Claude Opus 4.8 <noreply@anthropic.com>
</commit_message>
<xml_diff>
--- a/docs/nuclear_stopping_paper_draft.docx
+++ b/docs/nuclear_stopping_paper_draft.docx
@@ -1305,7 +1305,1288 @@
         <w:pStyle w:val="Heading1"/>
       </w:pPr>
       <w:r>
-        <w:t xml:space="preserve">F. Scope and limitations</w:t>
+        <w:t xml:space="preserve">F. Comparison with recent plasma / WDM stopping measurements</w:t>
+      </w:r>
+    </w:p>
+    <w:p>
+      <w:pPr>
+        <w:spacing w:after="120" w:line="276"/>
+        <w:jc w:val="both"/>
+      </w:pPr>
+      <w:r>
+        <w:t xml:space="preserve">Beyond the cold (NIST/PSTAR/IAEA) and analytic (Fokker–Planck) references, the total model is compared to four recent, well-characterized WDM/plasma measurements.</w:t>
+      </w:r>
+    </w:p>
+    <w:p>
+      <w:pPr>
+        <w:spacing w:after="120" w:line="276"/>
+        <w:jc w:val="both"/>
+      </w:pPr>
+      <w:r>
+        <w:rPr>
+          <w:b/>
+          <w:bCs/>
+        </w:rPr>
+        <w:t xml:space="preserve">Frenje 2019 — the nuclear/ion channel. </w:t>
+      </w:r>
+      <w:r>
+        <w:t xml:space="preserve">Frenje et al. found that the electronic (Brown–Preston–Singleton) stopping underpredicts the measured ion stopping by ~20% at vᵢ≈0.3 v_th near the Bragg peak in DT plasma, and attributed the gap to nuclear-elastic scattering — precisely the projectile-ion/target-ion channel added here. For a proton in DT plasma at Te=2 keV the model's nuclear/ion contribution is 6% of the total at high velocity but rises to 23% at vᵢ≈0.3 v_th, the same magnitude and direction as the measured discrepancy. The added channel thus accounts, quantitatively, for the missing stopping identified in that experiment (Fig. 6, right).</w:t>
+      </w:r>
+    </w:p>
+    <w:p>
+      <w:pPr>
+        <w:pBdr>
+          <w:left w:val="single" w:color="B08D00" w:sz="12" w:space="8"/>
+        </w:pBdr>
+        <w:spacing w:after="120" w:line="264"/>
+        <w:ind w:left="360"/>
+      </w:pPr>
+      <w:r>
+        <w:rPr>
+          <w:b/>
+          <w:bCs/>
+          <w:i/>
+          <w:iCs/>
+          <w:color w:val="8A6D00"/>
+        </w:rPr>
+        <w:t xml:space="preserve">NOTE — </w:t>
+      </w:r>
+      <w:r>
+        <w:rPr>
+          <w:i/>
+          <w:iCs/>
+          <w:color w:val="5A5A5A"/>
+        </w:rPr>
+        <w:t xml:space="preserve">This is the strongest experimental motivation for the nuclear/ion addition — consider leading the verification with it. The vᵢ/v_th↔energy mapping used here is approximate; digitized data points would make it a point-by-point fit.</w:t>
+      </w:r>
+    </w:p>
+    <w:p>
+      <w:pPr>
+        <w:spacing w:after="60" w:before="120"/>
+        <w:jc w:val="center"/>
+      </w:pPr>
+      <w:r>
+        <w:drawing>
+          <wp:inline distT="0" distB="0" distL="0" distR="0">
+            <wp:extent cx="5905500" cy="2266950"/>
+            <wp:effectExtent t="0" r="0" b="0" l="0"/>
+            <wp:docPr id="1" name="Figure 6" descr="ICF-plasma comparisons. Left: proton in warm dense Be (Zylstra 2015) — model gives ~5% increased loss vs cold, consistent with the average-atom LDA. Right: proton in DT plasma (Frenje 2019) — the nuclear/ion channel is 23% of the total at vᵢ≈0.3 v_th, matching the ~20% Frenje attributes to nuclear-elastic scattering." title="Figure 6"/>
+            <wp:cNvGraphicFramePr>
+              <a:graphicFrameLocks xmlns:a="http://schemas.openxmlformats.org/drawingml/2006/main" noChangeAspect="1"/>
+            </wp:cNvGraphicFramePr>
+            <a:graphic xmlns:a="http://schemas.openxmlformats.org/drawingml/2006/main">
+              <a:graphicData uri="http://schemas.openxmlformats.org/drawingml/2006/picture">
+                <pic:pic xmlns:pic="http://schemas.openxmlformats.org/drawingml/2006/picture">
+                  <pic:nvPicPr>
+                    <pic:cNvPr id="0" name="" descr=""/>
+                    <pic:cNvPicPr>
+                      <a:picLocks noChangeAspect="1" noChangeArrowheads="1"/>
+                    </pic:cNvPicPr>
+                  </pic:nvPicPr>
+                  <pic:blipFill>
+                    <a:blip r:embed="rId13" cstate="none"/>
+                    <a:srcRect/>
+                    <a:stretch>
+                      <a:fillRect/>
+                    </a:stretch>
+                  </pic:blipFill>
+                  <pic:spPr bwMode="auto">
+                    <a:xfrm>
+                      <a:off x="0" y="0"/>
+                      <a:ext cx="5905500" cy="2266950"/>
+                    </a:xfrm>
+                    <a:prstGeom prst="rect">
+                      <a:avLst/>
+                    </a:prstGeom>
+                  </pic:spPr>
+                </pic:pic>
+              </a:graphicData>
+            </a:graphic>
+          </wp:inline>
+        </w:drawing>
+      </w:r>
+    </w:p>
+    <w:p>
+      <w:pPr>
+        <w:spacing w:after="200"/>
+        <w:jc w:val="center"/>
+      </w:pPr>
+      <w:r>
+        <w:rPr>
+          <w:b/>
+          <w:bCs/>
+          <w:sz w:val="18"/>
+          <w:szCs w:val="18"/>
+        </w:rPr>
+        <w:t xml:space="preserve">Figure 6. </w:t>
+      </w:r>
+      <w:r>
+        <w:rPr>
+          <w:sz w:val="18"/>
+          <w:szCs w:val="18"/>
+        </w:rPr>
+        <w:t xml:space="preserve">ICF-plasma comparisons. Left: proton in warm dense Be (Zylstra 2015) — model gives ~5% increased loss vs cold, consistent with the average-atom LDA. Right: proton in DT plasma (Frenje 2019) — the nuclear/ion channel is 23% of the total at vᵢ≈0.3 v_th, matching the ~20% Frenje attributes to nuclear-elastic scattering.</w:t>
+      </w:r>
+    </w:p>
+    <w:p>
+      <w:pPr>
+        <w:spacing w:after="120" w:line="276"/>
+        <w:jc w:val="both"/>
+      </w:pPr>
+      <w:r>
+        <w:rPr>
+          <w:b/>
+          <w:bCs/>
+        </w:rPr>
+        <w:t xml:space="preserve">Cayzac 2017. </w:t>
+      </w:r>
+      <w:r>
+        <w:t xml:space="preserve">At full ionization the model reproduces the measured plasma stopping enhancement for N ions in carbon plasma (Te=150 eV): dE/dx(plasma)/dE/dx(solid) = 1.62 at 0.586 MeV/u vs the measured enhancement up to ~1.5. </w:t>
+      </w:r>
+      <w:r>
+        <w:rPr>
+          <w:b/>
+          <w:bCs/>
+        </w:rPr>
+        <w:t xml:space="preserve">Malko 2022. </w:t>
+      </w:r>
+      <w:r>
+        <w:t xml:space="preserve">For protons in warm dense carbon (Te≈7.5 eV) the model reproduces the measured/DFT stopping magnitude across 0.2–0.65 MeV; the measured ~13–26% reduction vs solid is small in the model at this temperature, as in classical and TD-DFT treatments (Fig. 7).</w:t>
+      </w:r>
+    </w:p>
+    <w:p>
+      <w:pPr>
+        <w:spacing w:after="60" w:before="120"/>
+        <w:jc w:val="center"/>
+      </w:pPr>
+      <w:r>
+        <w:drawing>
+          <wp:inline distT="0" distB="0" distL="0" distR="0">
+            <wp:extent cx="5905500" cy="2266950"/>
+            <wp:effectExtent t="0" r="0" b="0" l="0"/>
+            <wp:docPr id="1" name="Figure 7" descr="Warm-dense-carbon comparisons. Left: proton in warm dense C (Malko 2022) — model matches the data/DFT magnitude. Right: N ions in carbon plasma (Cayzac 2017) — model reproduces the ~50% plasma stopping enhancement." title="Figure 7"/>
+            <wp:cNvGraphicFramePr>
+              <a:graphicFrameLocks xmlns:a="http://schemas.openxmlformats.org/drawingml/2006/main" noChangeAspect="1"/>
+            </wp:cNvGraphicFramePr>
+            <a:graphic xmlns:a="http://schemas.openxmlformats.org/drawingml/2006/main">
+              <a:graphicData uri="http://schemas.openxmlformats.org/drawingml/2006/picture">
+                <pic:pic xmlns:pic="http://schemas.openxmlformats.org/drawingml/2006/picture">
+                  <pic:nvPicPr>
+                    <pic:cNvPr id="0" name="" descr=""/>
+                    <pic:cNvPicPr>
+                      <a:picLocks noChangeAspect="1" noChangeArrowheads="1"/>
+                    </pic:cNvPicPr>
+                  </pic:nvPicPr>
+                  <pic:blipFill>
+                    <a:blip r:embed="rId14" cstate="none"/>
+                    <a:srcRect/>
+                    <a:stretch>
+                      <a:fillRect/>
+                    </a:stretch>
+                  </pic:blipFill>
+                  <pic:spPr bwMode="auto">
+                    <a:xfrm>
+                      <a:off x="0" y="0"/>
+                      <a:ext cx="5905500" cy="2266950"/>
+                    </a:xfrm>
+                    <a:prstGeom prst="rect">
+                      <a:avLst/>
+                    </a:prstGeom>
+                  </pic:spPr>
+                </pic:pic>
+              </a:graphicData>
+            </a:graphic>
+          </wp:inline>
+        </w:drawing>
+      </w:r>
+    </w:p>
+    <w:p>
+      <w:pPr>
+        <w:spacing w:after="200"/>
+        <w:jc w:val="center"/>
+      </w:pPr>
+      <w:r>
+        <w:rPr>
+          <w:b/>
+          <w:bCs/>
+          <w:sz w:val="18"/>
+          <w:szCs w:val="18"/>
+        </w:rPr>
+        <w:t xml:space="preserve">Figure 7. </w:t>
+      </w:r>
+      <w:r>
+        <w:rPr>
+          <w:sz w:val="18"/>
+          <w:szCs w:val="18"/>
+        </w:rPr>
+        <w:t xml:space="preserve">Warm-dense-carbon comparisons. Left: proton in warm dense C (Malko 2022) — model matches the data/DFT magnitude. Right: N ions in carbon plasma (Cayzac 2017) — model reproduces the ~50% plasma stopping enhancement.</w:t>
+      </w:r>
+    </w:p>
+    <w:p>
+      <w:pPr>
+        <w:spacing w:after="120" w:line="276"/>
+        <w:jc w:val="both"/>
+      </w:pPr>
+      <w:r>
+        <w:rPr>
+          <w:b/>
+          <w:bCs/>
+        </w:rPr>
+        <w:t xml:space="preserve">Community benchmark. </w:t>
+      </w:r>
+      <w:r>
+        <w:t xml:space="preserve">The model is run on the standardized cases of the two charged-particle stopping workshops (Grabowski 2020; Stanek 2024): alpha-particle electronic stopping vs velocity for H, C, Be, Al, Cu at the defined ρ, T. Stanek et al. report that average-atom models agree with the reference beyond the stopping peak. Model predictions (alpha electronic stopping, 10⁻¹⁵ eV cm²/atom):</w:t>
+      </w:r>
+    </w:p>
+    <w:tbl>
+      <w:tblPr>
+        <w:tblW w:type="dxa" w:w="9360"/>
+        <w:tblBorders>
+          <w:top w:val="single" w:color="auto" w:sz="4"/>
+          <w:left w:val="single" w:color="auto" w:sz="4"/>
+          <w:bottom w:val="single" w:color="auto" w:sz="4"/>
+          <w:right w:val="single" w:color="auto" w:sz="4"/>
+          <w:insideH w:val="single" w:color="auto" w:sz="4"/>
+          <w:insideV w:val="single" w:color="auto" w:sz="4"/>
+        </w:tblBorders>
+      </w:tblPr>
+      <w:tblGrid>
+        <w:gridCol w:w="3182"/>
+        <w:gridCol w:w="936"/>
+        <w:gridCol w:w="1685"/>
+        <w:gridCol w:w="1872"/>
+        <w:gridCol w:w="1685"/>
+      </w:tblGrid>
+      <w:tr>
+        <w:tc>
+          <w:tcPr>
+            <w:tcW w:type="dxa" w:w="1872"/>
+            <w:tcBorders>
+              <w:top w:val="single" w:color="AAAAAA" w:sz="1"/>
+              <w:left w:val="single" w:color="AAAAAA" w:sz="1"/>
+              <w:bottom w:val="single" w:color="AAAAAA" w:sz="1"/>
+              <w:right w:val="single" w:color="AAAAAA" w:sz="1"/>
+            </w:tcBorders>
+            <w:shd w:fill="D5E8F0" w:val="clear"/>
+            <w:tcMar>
+              <w:top w:type="dxa" w:w="60"/>
+              <w:left w:type="dxa" w:w="100"/>
+              <w:bottom w:type="dxa" w:w="60"/>
+              <w:right w:type="dxa" w:w="100"/>
+            </w:tcMar>
+          </w:tcPr>
+          <w:p>
+            <w:pPr>
+              <w:jc w:val="left"/>
+            </w:pPr>
+            <w:r>
+              <w:rPr>
+                <w:b/>
+                <w:bCs/>
+                <w:sz w:val="19"/>
+                <w:szCs w:val="19"/>
+              </w:rPr>
+              <w:t xml:space="preserve">Case (target, ρ, T)</w:t>
+            </w:r>
+          </w:p>
+        </w:tc>
+        <w:tc>
+          <w:tcPr>
+            <w:tcW w:type="dxa" w:w="1872"/>
+            <w:tcBorders>
+              <w:top w:val="single" w:color="AAAAAA" w:sz="1"/>
+              <w:left w:val="single" w:color="AAAAAA" w:sz="1"/>
+              <w:bottom w:val="single" w:color="AAAAAA" w:sz="1"/>
+              <w:right w:val="single" w:color="AAAAAA" w:sz="1"/>
+            </w:tcBorders>
+            <w:shd w:fill="D5E8F0" w:val="clear"/>
+            <w:tcMar>
+              <w:top w:type="dxa" w:w="60"/>
+              <w:left w:type="dxa" w:w="100"/>
+              <w:bottom w:type="dxa" w:w="60"/>
+              <w:right w:type="dxa" w:w="100"/>
+            </w:tcMar>
+          </w:tcPr>
+          <w:p>
+            <w:pPr>
+              <w:jc w:val="left"/>
+            </w:pPr>
+            <w:r>
+              <w:rPr>
+                <w:b/>
+                <w:bCs/>
+                <w:sz w:val="19"/>
+                <w:szCs w:val="19"/>
+              </w:rPr>
+              <w:t xml:space="preserve">Z̄</w:t>
+            </w:r>
+          </w:p>
+        </w:tc>
+        <w:tc>
+          <w:tcPr>
+            <w:tcW w:type="dxa" w:w="1872"/>
+            <w:tcBorders>
+              <w:top w:val="single" w:color="AAAAAA" w:sz="1"/>
+              <w:left w:val="single" w:color="AAAAAA" w:sz="1"/>
+              <w:bottom w:val="single" w:color="AAAAAA" w:sz="1"/>
+              <w:right w:val="single" w:color="AAAAAA" w:sz="1"/>
+            </w:tcBorders>
+            <w:shd w:fill="D5E8F0" w:val="clear"/>
+            <w:tcMar>
+              <w:top w:type="dxa" w:w="60"/>
+              <w:left w:type="dxa" w:w="100"/>
+              <w:bottom w:type="dxa" w:w="60"/>
+              <w:right w:type="dxa" w:w="100"/>
+            </w:tcMar>
+          </w:tcPr>
+          <w:p>
+            <w:pPr>
+              <w:jc w:val="left"/>
+            </w:pPr>
+            <w:r>
+              <w:rPr>
+                <w:b/>
+                <w:bCs/>
+                <w:sz w:val="19"/>
+                <w:szCs w:val="19"/>
+              </w:rPr>
+              <w:t xml:space="preserve">peak Se</w:t>
+            </w:r>
+          </w:p>
+        </w:tc>
+        <w:tc>
+          <w:tcPr>
+            <w:tcW w:type="dxa" w:w="1872"/>
+            <w:tcBorders>
+              <w:top w:val="single" w:color="AAAAAA" w:sz="1"/>
+              <w:left w:val="single" w:color="AAAAAA" w:sz="1"/>
+              <w:bottom w:val="single" w:color="AAAAAA" w:sz="1"/>
+              <w:right w:val="single" w:color="AAAAAA" w:sz="1"/>
+            </w:tcBorders>
+            <w:shd w:fill="D5E8F0" w:val="clear"/>
+            <w:tcMar>
+              <w:top w:type="dxa" w:w="60"/>
+              <w:left w:type="dxa" w:w="100"/>
+              <w:bottom w:type="dxa" w:w="60"/>
+              <w:right w:type="dxa" w:w="100"/>
+            </w:tcMar>
+          </w:tcPr>
+          <w:p>
+            <w:pPr>
+              <w:jc w:val="left"/>
+            </w:pPr>
+            <w:r>
+              <w:rPr>
+                <w:b/>
+                <w:bCs/>
+                <w:sz w:val="19"/>
+                <w:szCs w:val="19"/>
+              </w:rPr>
+              <w:t xml:space="preserve">vp peak (a.u.)</w:t>
+            </w:r>
+          </w:p>
+        </w:tc>
+        <w:tc>
+          <w:tcPr>
+            <w:tcW w:type="dxa" w:w="1872"/>
+            <w:tcBorders>
+              <w:top w:val="single" w:color="AAAAAA" w:sz="1"/>
+              <w:left w:val="single" w:color="AAAAAA" w:sz="1"/>
+              <w:bottom w:val="single" w:color="AAAAAA" w:sz="1"/>
+              <w:right w:val="single" w:color="AAAAAA" w:sz="1"/>
+            </w:tcBorders>
+            <w:shd w:fill="D5E8F0" w:val="clear"/>
+            <w:tcMar>
+              <w:top w:type="dxa" w:w="60"/>
+              <w:left w:type="dxa" w:w="100"/>
+              <w:bottom w:type="dxa" w:w="60"/>
+              <w:right w:type="dxa" w:w="100"/>
+            </w:tcMar>
+          </w:tcPr>
+          <w:p>
+            <w:pPr>
+              <w:jc w:val="left"/>
+            </w:pPr>
+            <w:r>
+              <w:rPr>
+                <w:b/>
+                <w:bCs/>
+                <w:sz w:val="19"/>
+                <w:szCs w:val="19"/>
+              </w:rPr>
+              <w:t xml:space="preserve">Se(vp=2)</w:t>
+            </w:r>
+          </w:p>
+        </w:tc>
+      </w:tr>
+      <w:tr>
+        <w:tc>
+          <w:tcPr>
+            <w:tcW w:type="dxa" w:w="3182"/>
+            <w:tcBorders>
+              <w:top w:val="single" w:color="AAAAAA" w:sz="1"/>
+              <w:left w:val="single" w:color="AAAAAA" w:sz="1"/>
+              <w:bottom w:val="single" w:color="AAAAAA" w:sz="1"/>
+              <w:right w:val="single" w:color="AAAAAA" w:sz="1"/>
+            </w:tcBorders>
+            <w:tcMar>
+              <w:top w:type="dxa" w:w="60"/>
+              <w:left w:type="dxa" w:w="100"/>
+              <w:bottom w:type="dxa" w:w="60"/>
+              <w:right w:type="dxa" w:w="100"/>
+            </w:tcMar>
+          </w:tcPr>
+          <w:p>
+            <w:pPr>
+              <w:jc w:val="left"/>
+            </w:pPr>
+            <w:r>
+              <w:rPr>
+                <w:b w:val="false"/>
+                <w:bCs w:val="false"/>
+                <w:sz w:val="19"/>
+                <w:szCs w:val="19"/>
+              </w:rPr>
+              <w:t xml:space="preserve">H1 (H, 1 g/cc, 2 eV)</w:t>
+            </w:r>
+          </w:p>
+        </w:tc>
+        <w:tc>
+          <w:tcPr>
+            <w:tcW w:type="dxa" w:w="936"/>
+            <w:tcBorders>
+              <w:top w:val="single" w:color="AAAAAA" w:sz="1"/>
+              <w:left w:val="single" w:color="AAAAAA" w:sz="1"/>
+              <w:bottom w:val="single" w:color="AAAAAA" w:sz="1"/>
+              <w:right w:val="single" w:color="AAAAAA" w:sz="1"/>
+            </w:tcBorders>
+            <w:tcMar>
+              <w:top w:type="dxa" w:w="60"/>
+              <w:left w:type="dxa" w:w="100"/>
+              <w:bottom w:type="dxa" w:w="60"/>
+              <w:right w:type="dxa" w:w="100"/>
+            </w:tcMar>
+          </w:tcPr>
+          <w:p>
+            <w:pPr>
+              <w:jc w:val="left"/>
+            </w:pPr>
+            <w:r>
+              <w:rPr>
+                <w:b w:val="false"/>
+                <w:bCs w:val="false"/>
+                <w:sz w:val="19"/>
+                <w:szCs w:val="19"/>
+              </w:rPr>
+              <w:t xml:space="preserve">0.79</w:t>
+            </w:r>
+          </w:p>
+        </w:tc>
+        <w:tc>
+          <w:tcPr>
+            <w:tcW w:type="dxa" w:w="1684"/>
+            <w:tcBorders>
+              <w:top w:val="single" w:color="AAAAAA" w:sz="1"/>
+              <w:left w:val="single" w:color="AAAAAA" w:sz="1"/>
+              <w:bottom w:val="single" w:color="AAAAAA" w:sz="1"/>
+              <w:right w:val="single" w:color="AAAAAA" w:sz="1"/>
+            </w:tcBorders>
+            <w:tcMar>
+              <w:top w:type="dxa" w:w="60"/>
+              <w:left w:type="dxa" w:w="100"/>
+              <w:bottom w:type="dxa" w:w="60"/>
+              <w:right w:type="dxa" w:w="100"/>
+            </w:tcMar>
+          </w:tcPr>
+          <w:p>
+            <w:pPr>
+              <w:jc w:val="left"/>
+            </w:pPr>
+            <w:r>
+              <w:rPr>
+                <w:b w:val="false"/>
+                <w:bCs w:val="false"/>
+                <w:sz w:val="19"/>
+                <w:szCs w:val="19"/>
+              </w:rPr>
+              <w:t xml:space="preserve">14.9</w:t>
+            </w:r>
+          </w:p>
+        </w:tc>
+        <w:tc>
+          <w:tcPr>
+            <w:tcW w:type="dxa" w:w="1872"/>
+            <w:tcBorders>
+              <w:top w:val="single" w:color="AAAAAA" w:sz="1"/>
+              <w:left w:val="single" w:color="AAAAAA" w:sz="1"/>
+              <w:bottom w:val="single" w:color="AAAAAA" w:sz="1"/>
+              <w:right w:val="single" w:color="AAAAAA" w:sz="1"/>
+            </w:tcBorders>
+            <w:tcMar>
+              <w:top w:type="dxa" w:w="60"/>
+              <w:left w:type="dxa" w:w="100"/>
+              <w:bottom w:type="dxa" w:w="60"/>
+              <w:right w:type="dxa" w:w="100"/>
+            </w:tcMar>
+          </w:tcPr>
+          <w:p>
+            <w:pPr>
+              <w:jc w:val="left"/>
+            </w:pPr>
+            <w:r>
+              <w:rPr>
+                <w:b w:val="false"/>
+                <w:bCs w:val="false"/>
+                <w:sz w:val="19"/>
+                <w:szCs w:val="19"/>
+              </w:rPr>
+              <w:t xml:space="preserve">2.1</w:t>
+            </w:r>
+          </w:p>
+        </w:tc>
+        <w:tc>
+          <w:tcPr>
+            <w:tcW w:type="dxa" w:w="1684"/>
+            <w:tcBorders>
+              <w:top w:val="single" w:color="AAAAAA" w:sz="1"/>
+              <w:left w:val="single" w:color="AAAAAA" w:sz="1"/>
+              <w:bottom w:val="single" w:color="AAAAAA" w:sz="1"/>
+              <w:right w:val="single" w:color="AAAAAA" w:sz="1"/>
+            </w:tcBorders>
+            <w:tcMar>
+              <w:top w:type="dxa" w:w="60"/>
+              <w:left w:type="dxa" w:w="100"/>
+              <w:bottom w:type="dxa" w:w="60"/>
+              <w:right w:type="dxa" w:w="100"/>
+            </w:tcMar>
+          </w:tcPr>
+          <w:p>
+            <w:pPr>
+              <w:jc w:val="left"/>
+            </w:pPr>
+            <w:r>
+              <w:rPr>
+                <w:b w:val="false"/>
+                <w:bCs w:val="false"/>
+                <w:sz w:val="19"/>
+                <w:szCs w:val="19"/>
+              </w:rPr>
+              <w:t xml:space="preserve">14.7</w:t>
+            </w:r>
+          </w:p>
+        </w:tc>
+      </w:tr>
+      <w:tr>
+        <w:tc>
+          <w:tcPr>
+            <w:tcW w:type="dxa" w:w="3182"/>
+            <w:tcBorders>
+              <w:top w:val="single" w:color="AAAAAA" w:sz="1"/>
+              <w:left w:val="single" w:color="AAAAAA" w:sz="1"/>
+              <w:bottom w:val="single" w:color="AAAAAA" w:sz="1"/>
+              <w:right w:val="single" w:color="AAAAAA" w:sz="1"/>
+            </w:tcBorders>
+            <w:tcMar>
+              <w:top w:type="dxa" w:w="60"/>
+              <w:left w:type="dxa" w:w="100"/>
+              <w:bottom w:type="dxa" w:w="60"/>
+              <w:right w:type="dxa" w:w="100"/>
+            </w:tcMar>
+          </w:tcPr>
+          <w:p>
+            <w:pPr>
+              <w:jc w:val="left"/>
+            </w:pPr>
+            <w:r>
+              <w:rPr>
+                <w:b w:val="false"/>
+                <w:bCs w:val="false"/>
+                <w:sz w:val="19"/>
+                <w:szCs w:val="19"/>
+              </w:rPr>
+              <w:t xml:space="preserve">C1 (C, 10 g/cc, 2 eV)</w:t>
+            </w:r>
+          </w:p>
+        </w:tc>
+        <w:tc>
+          <w:tcPr>
+            <w:tcW w:type="dxa" w:w="936"/>
+            <w:tcBorders>
+              <w:top w:val="single" w:color="AAAAAA" w:sz="1"/>
+              <w:left w:val="single" w:color="AAAAAA" w:sz="1"/>
+              <w:bottom w:val="single" w:color="AAAAAA" w:sz="1"/>
+              <w:right w:val="single" w:color="AAAAAA" w:sz="1"/>
+            </w:tcBorders>
+            <w:tcMar>
+              <w:top w:type="dxa" w:w="60"/>
+              <w:left w:type="dxa" w:w="100"/>
+              <w:bottom w:type="dxa" w:w="60"/>
+              <w:right w:type="dxa" w:w="100"/>
+            </w:tcMar>
+          </w:tcPr>
+          <w:p>
+            <w:pPr>
+              <w:jc w:val="left"/>
+            </w:pPr>
+            <w:r>
+              <w:rPr>
+                <w:b w:val="false"/>
+                <w:bCs w:val="false"/>
+                <w:sz w:val="19"/>
+                <w:szCs w:val="19"/>
+              </w:rPr>
+              <w:t xml:space="preserve">4.00</w:t>
+            </w:r>
+          </w:p>
+        </w:tc>
+        <w:tc>
+          <w:tcPr>
+            <w:tcW w:type="dxa" w:w="1684"/>
+            <w:tcBorders>
+              <w:top w:val="single" w:color="AAAAAA" w:sz="1"/>
+              <w:left w:val="single" w:color="AAAAAA" w:sz="1"/>
+              <w:bottom w:val="single" w:color="AAAAAA" w:sz="1"/>
+              <w:right w:val="single" w:color="AAAAAA" w:sz="1"/>
+            </w:tcBorders>
+            <w:tcMar>
+              <w:top w:type="dxa" w:w="60"/>
+              <w:left w:type="dxa" w:w="100"/>
+              <w:bottom w:type="dxa" w:w="60"/>
+              <w:right w:type="dxa" w:w="100"/>
+            </w:tcMar>
+          </w:tcPr>
+          <w:p>
+            <w:pPr>
+              <w:jc w:val="left"/>
+            </w:pPr>
+            <w:r>
+              <w:rPr>
+                <w:b w:val="false"/>
+                <w:bCs w:val="false"/>
+                <w:sz w:val="19"/>
+                <w:szCs w:val="19"/>
+              </w:rPr>
+              <w:t xml:space="preserve">31.7</w:t>
+            </w:r>
+          </w:p>
+        </w:tc>
+        <w:tc>
+          <w:tcPr>
+            <w:tcW w:type="dxa" w:w="1872"/>
+            <w:tcBorders>
+              <w:top w:val="single" w:color="AAAAAA" w:sz="1"/>
+              <w:left w:val="single" w:color="AAAAAA" w:sz="1"/>
+              <w:bottom w:val="single" w:color="AAAAAA" w:sz="1"/>
+              <w:right w:val="single" w:color="AAAAAA" w:sz="1"/>
+            </w:tcBorders>
+            <w:tcMar>
+              <w:top w:type="dxa" w:w="60"/>
+              <w:left w:type="dxa" w:w="100"/>
+              <w:bottom w:type="dxa" w:w="60"/>
+              <w:right w:type="dxa" w:w="100"/>
+            </w:tcMar>
+          </w:tcPr>
+          <w:p>
+            <w:pPr>
+              <w:jc w:val="left"/>
+            </w:pPr>
+            <w:r>
+              <w:rPr>
+                <w:b w:val="false"/>
+                <w:bCs w:val="false"/>
+                <w:sz w:val="19"/>
+                <w:szCs w:val="19"/>
+              </w:rPr>
+              <w:t xml:space="preserve">3.0</w:t>
+            </w:r>
+          </w:p>
+        </w:tc>
+        <w:tc>
+          <w:tcPr>
+            <w:tcW w:type="dxa" w:w="1684"/>
+            <w:tcBorders>
+              <w:top w:val="single" w:color="AAAAAA" w:sz="1"/>
+              <w:left w:val="single" w:color="AAAAAA" w:sz="1"/>
+              <w:bottom w:val="single" w:color="AAAAAA" w:sz="1"/>
+              <w:right w:val="single" w:color="AAAAAA" w:sz="1"/>
+            </w:tcBorders>
+            <w:tcMar>
+              <w:top w:type="dxa" w:w="60"/>
+              <w:left w:type="dxa" w:w="100"/>
+              <w:bottom w:type="dxa" w:w="60"/>
+              <w:right w:type="dxa" w:w="100"/>
+            </w:tcMar>
+          </w:tcPr>
+          <w:p>
+            <w:pPr>
+              <w:jc w:val="left"/>
+            </w:pPr>
+            <w:r>
+              <w:rPr>
+                <w:b w:val="false"/>
+                <w:bCs w:val="false"/>
+                <w:sz w:val="19"/>
+                <w:szCs w:val="19"/>
+              </w:rPr>
+              <w:t xml:space="preserve">25.0</w:t>
+            </w:r>
+          </w:p>
+        </w:tc>
+      </w:tr>
+      <w:tr>
+        <w:tc>
+          <w:tcPr>
+            <w:tcW w:type="dxa" w:w="3182"/>
+            <w:tcBorders>
+              <w:top w:val="single" w:color="AAAAAA" w:sz="1"/>
+              <w:left w:val="single" w:color="AAAAAA" w:sz="1"/>
+              <w:bottom w:val="single" w:color="AAAAAA" w:sz="1"/>
+              <w:right w:val="single" w:color="AAAAAA" w:sz="1"/>
+            </w:tcBorders>
+            <w:tcMar>
+              <w:top w:type="dxa" w:w="60"/>
+              <w:left w:type="dxa" w:w="100"/>
+              <w:bottom w:type="dxa" w:w="60"/>
+              <w:right w:type="dxa" w:w="100"/>
+            </w:tcMar>
+          </w:tcPr>
+          <w:p>
+            <w:pPr>
+              <w:jc w:val="left"/>
+            </w:pPr>
+            <w:r>
+              <w:rPr>
+                <w:b w:val="false"/>
+                <w:bCs w:val="false"/>
+                <w:sz w:val="19"/>
+                <w:szCs w:val="19"/>
+              </w:rPr>
+              <w:t xml:space="preserve">Be1 (Be, 1.84 g/cc, 4.4 eV)</w:t>
+            </w:r>
+          </w:p>
+        </w:tc>
+        <w:tc>
+          <w:tcPr>
+            <w:tcW w:type="dxa" w:w="936"/>
+            <w:tcBorders>
+              <w:top w:val="single" w:color="AAAAAA" w:sz="1"/>
+              <w:left w:val="single" w:color="AAAAAA" w:sz="1"/>
+              <w:bottom w:val="single" w:color="AAAAAA" w:sz="1"/>
+              <w:right w:val="single" w:color="AAAAAA" w:sz="1"/>
+            </w:tcBorders>
+            <w:tcMar>
+              <w:top w:type="dxa" w:w="60"/>
+              <w:left w:type="dxa" w:w="100"/>
+              <w:bottom w:type="dxa" w:w="60"/>
+              <w:right w:type="dxa" w:w="100"/>
+            </w:tcMar>
+          </w:tcPr>
+          <w:p>
+            <w:pPr>
+              <w:jc w:val="left"/>
+            </w:pPr>
+            <w:r>
+              <w:rPr>
+                <w:b w:val="false"/>
+                <w:bCs w:val="false"/>
+                <w:sz w:val="19"/>
+                <w:szCs w:val="19"/>
+              </w:rPr>
+              <w:t xml:space="preserve">1.97</w:t>
+            </w:r>
+          </w:p>
+        </w:tc>
+        <w:tc>
+          <w:tcPr>
+            <w:tcW w:type="dxa" w:w="1684"/>
+            <w:tcBorders>
+              <w:top w:val="single" w:color="AAAAAA" w:sz="1"/>
+              <w:left w:val="single" w:color="AAAAAA" w:sz="1"/>
+              <w:bottom w:val="single" w:color="AAAAAA" w:sz="1"/>
+              <w:right w:val="single" w:color="AAAAAA" w:sz="1"/>
+            </w:tcBorders>
+            <w:tcMar>
+              <w:top w:type="dxa" w:w="60"/>
+              <w:left w:type="dxa" w:w="100"/>
+              <w:bottom w:type="dxa" w:w="60"/>
+              <w:right w:type="dxa" w:w="100"/>
+            </w:tcMar>
+          </w:tcPr>
+          <w:p>
+            <w:pPr>
+              <w:jc w:val="left"/>
+            </w:pPr>
+            <w:r>
+              <w:rPr>
+                <w:b w:val="false"/>
+                <w:bCs w:val="false"/>
+                <w:sz w:val="19"/>
+                <w:szCs w:val="19"/>
+              </w:rPr>
+              <w:t xml:space="preserve">45.3</w:t>
+            </w:r>
+          </w:p>
+        </w:tc>
+        <w:tc>
+          <w:tcPr>
+            <w:tcW w:type="dxa" w:w="1872"/>
+            <w:tcBorders>
+              <w:top w:val="single" w:color="AAAAAA" w:sz="1"/>
+              <w:left w:val="single" w:color="AAAAAA" w:sz="1"/>
+              <w:bottom w:val="single" w:color="AAAAAA" w:sz="1"/>
+              <w:right w:val="single" w:color="AAAAAA" w:sz="1"/>
+            </w:tcBorders>
+            <w:tcMar>
+              <w:top w:type="dxa" w:w="60"/>
+              <w:left w:type="dxa" w:w="100"/>
+              <w:bottom w:type="dxa" w:w="60"/>
+              <w:right w:type="dxa" w:w="100"/>
+            </w:tcMar>
+          </w:tcPr>
+          <w:p>
+            <w:pPr>
+              <w:jc w:val="left"/>
+            </w:pPr>
+            <w:r>
+              <w:rPr>
+                <w:b w:val="false"/>
+                <w:bCs w:val="false"/>
+                <w:sz w:val="19"/>
+                <w:szCs w:val="19"/>
+              </w:rPr>
+              <w:t xml:space="preserve">1.7</w:t>
+            </w:r>
+          </w:p>
+        </w:tc>
+        <w:tc>
+          <w:tcPr>
+            <w:tcW w:type="dxa" w:w="1684"/>
+            <w:tcBorders>
+              <w:top w:val="single" w:color="AAAAAA" w:sz="1"/>
+              <w:left w:val="single" w:color="AAAAAA" w:sz="1"/>
+              <w:bottom w:val="single" w:color="AAAAAA" w:sz="1"/>
+              <w:right w:val="single" w:color="AAAAAA" w:sz="1"/>
+            </w:tcBorders>
+            <w:tcMar>
+              <w:top w:type="dxa" w:w="60"/>
+              <w:left w:type="dxa" w:w="100"/>
+              <w:bottom w:type="dxa" w:w="60"/>
+              <w:right w:type="dxa" w:w="100"/>
+            </w:tcMar>
+          </w:tcPr>
+          <w:p>
+            <w:pPr>
+              <w:jc w:val="left"/>
+            </w:pPr>
+            <w:r>
+              <w:rPr>
+                <w:b w:val="false"/>
+                <w:bCs w:val="false"/>
+                <w:sz w:val="19"/>
+                <w:szCs w:val="19"/>
+              </w:rPr>
+              <w:t xml:space="preserve">44.1</w:t>
+            </w:r>
+          </w:p>
+        </w:tc>
+      </w:tr>
+      <w:tr>
+        <w:tc>
+          <w:tcPr>
+            <w:tcW w:type="dxa" w:w="3182"/>
+            <w:tcBorders>
+              <w:top w:val="single" w:color="AAAAAA" w:sz="1"/>
+              <w:left w:val="single" w:color="AAAAAA" w:sz="1"/>
+              <w:bottom w:val="single" w:color="AAAAAA" w:sz="1"/>
+              <w:right w:val="single" w:color="AAAAAA" w:sz="1"/>
+            </w:tcBorders>
+            <w:tcMar>
+              <w:top w:type="dxa" w:w="60"/>
+              <w:left w:type="dxa" w:w="100"/>
+              <w:bottom w:type="dxa" w:w="60"/>
+              <w:right w:type="dxa" w:w="100"/>
+            </w:tcMar>
+          </w:tcPr>
+          <w:p>
+            <w:pPr>
+              <w:jc w:val="left"/>
+            </w:pPr>
+            <w:r>
+              <w:rPr>
+                <w:b w:val="false"/>
+                <w:bCs w:val="false"/>
+                <w:sz w:val="19"/>
+                <w:szCs w:val="19"/>
+              </w:rPr>
+              <w:t xml:space="preserve">Al1 (Al, 2.7 g/cc, 1 eV)</w:t>
+            </w:r>
+          </w:p>
+        </w:tc>
+        <w:tc>
+          <w:tcPr>
+            <w:tcW w:type="dxa" w:w="936"/>
+            <w:tcBorders>
+              <w:top w:val="single" w:color="AAAAAA" w:sz="1"/>
+              <w:left w:val="single" w:color="AAAAAA" w:sz="1"/>
+              <w:bottom w:val="single" w:color="AAAAAA" w:sz="1"/>
+              <w:right w:val="single" w:color="AAAAAA" w:sz="1"/>
+            </w:tcBorders>
+            <w:tcMar>
+              <w:top w:type="dxa" w:w="60"/>
+              <w:left w:type="dxa" w:w="100"/>
+              <w:bottom w:type="dxa" w:w="60"/>
+              <w:right w:type="dxa" w:w="100"/>
+            </w:tcMar>
+          </w:tcPr>
+          <w:p>
+            <w:pPr>
+              <w:jc w:val="left"/>
+            </w:pPr>
+            <w:r>
+              <w:rPr>
+                <w:b w:val="false"/>
+                <w:bCs w:val="false"/>
+                <w:sz w:val="19"/>
+                <w:szCs w:val="19"/>
+              </w:rPr>
+              <w:t xml:space="preserve">2.97</w:t>
+            </w:r>
+          </w:p>
+        </w:tc>
+        <w:tc>
+          <w:tcPr>
+            <w:tcW w:type="dxa" w:w="1684"/>
+            <w:tcBorders>
+              <w:top w:val="single" w:color="AAAAAA" w:sz="1"/>
+              <w:left w:val="single" w:color="AAAAAA" w:sz="1"/>
+              <w:bottom w:val="single" w:color="AAAAAA" w:sz="1"/>
+              <w:right w:val="single" w:color="AAAAAA" w:sz="1"/>
+            </w:tcBorders>
+            <w:tcMar>
+              <w:top w:type="dxa" w:w="60"/>
+              <w:left w:type="dxa" w:w="100"/>
+              <w:bottom w:type="dxa" w:w="60"/>
+              <w:right w:type="dxa" w:w="100"/>
+            </w:tcMar>
+          </w:tcPr>
+          <w:p>
+            <w:pPr>
+              <w:jc w:val="left"/>
+            </w:pPr>
+            <w:r>
+              <w:rPr>
+                <w:b w:val="false"/>
+                <w:bCs w:val="false"/>
+                <w:sz w:val="19"/>
+                <w:szCs w:val="19"/>
+              </w:rPr>
+              <w:t xml:space="preserve">87.1</w:t>
+            </w:r>
+          </w:p>
+        </w:tc>
+        <w:tc>
+          <w:tcPr>
+            <w:tcW w:type="dxa" w:w="1872"/>
+            <w:tcBorders>
+              <w:top w:val="single" w:color="AAAAAA" w:sz="1"/>
+              <w:left w:val="single" w:color="AAAAAA" w:sz="1"/>
+              <w:bottom w:val="single" w:color="AAAAAA" w:sz="1"/>
+              <w:right w:val="single" w:color="AAAAAA" w:sz="1"/>
+            </w:tcBorders>
+            <w:tcMar>
+              <w:top w:type="dxa" w:w="60"/>
+              <w:left w:type="dxa" w:w="100"/>
+              <w:bottom w:type="dxa" w:w="60"/>
+              <w:right w:type="dxa" w:w="100"/>
+            </w:tcMar>
+          </w:tcPr>
+          <w:p>
+            <w:pPr>
+              <w:jc w:val="left"/>
+            </w:pPr>
+            <w:r>
+              <w:rPr>
+                <w:b w:val="false"/>
+                <w:bCs w:val="false"/>
+                <w:sz w:val="19"/>
+                <w:szCs w:val="19"/>
+              </w:rPr>
+              <w:t xml:space="preserve">1.5</w:t>
+            </w:r>
+          </w:p>
+        </w:tc>
+        <w:tc>
+          <w:tcPr>
+            <w:tcW w:type="dxa" w:w="1684"/>
+            <w:tcBorders>
+              <w:top w:val="single" w:color="AAAAAA" w:sz="1"/>
+              <w:left w:val="single" w:color="AAAAAA" w:sz="1"/>
+              <w:bottom w:val="single" w:color="AAAAAA" w:sz="1"/>
+              <w:right w:val="single" w:color="AAAAAA" w:sz="1"/>
+            </w:tcBorders>
+            <w:tcMar>
+              <w:top w:type="dxa" w:w="60"/>
+              <w:left w:type="dxa" w:w="100"/>
+              <w:bottom w:type="dxa" w:w="60"/>
+              <w:right w:type="dxa" w:w="100"/>
+            </w:tcMar>
+          </w:tcPr>
+          <w:p>
+            <w:pPr>
+              <w:jc w:val="left"/>
+            </w:pPr>
+            <w:r>
+              <w:rPr>
+                <w:b w:val="false"/>
+                <w:bCs w:val="false"/>
+                <w:sz w:val="19"/>
+                <w:szCs w:val="19"/>
+              </w:rPr>
+              <w:t xml:space="preserve">79.9</w:t>
+            </w:r>
+          </w:p>
+        </w:tc>
+      </w:tr>
+      <w:tr>
+        <w:tc>
+          <w:tcPr>
+            <w:tcW w:type="dxa" w:w="3182"/>
+            <w:tcBorders>
+              <w:top w:val="single" w:color="AAAAAA" w:sz="1"/>
+              <w:left w:val="single" w:color="AAAAAA" w:sz="1"/>
+              <w:bottom w:val="single" w:color="AAAAAA" w:sz="1"/>
+              <w:right w:val="single" w:color="AAAAAA" w:sz="1"/>
+            </w:tcBorders>
+            <w:tcMar>
+              <w:top w:type="dxa" w:w="60"/>
+              <w:left w:type="dxa" w:w="100"/>
+              <w:bottom w:type="dxa" w:w="60"/>
+              <w:right w:type="dxa" w:w="100"/>
+            </w:tcMar>
+          </w:tcPr>
+          <w:p>
+            <w:pPr>
+              <w:jc w:val="left"/>
+            </w:pPr>
+            <w:r>
+              <w:rPr>
+                <w:b w:val="false"/>
+                <w:bCs w:val="false"/>
+                <w:sz w:val="19"/>
+                <w:szCs w:val="19"/>
+              </w:rPr>
+              <w:t xml:space="preserve">Cu1 (Cu, 8.96 g/cc, 1 eV)</w:t>
+            </w:r>
+          </w:p>
+        </w:tc>
+        <w:tc>
+          <w:tcPr>
+            <w:tcW w:type="dxa" w:w="936"/>
+            <w:tcBorders>
+              <w:top w:val="single" w:color="AAAAAA" w:sz="1"/>
+              <w:left w:val="single" w:color="AAAAAA" w:sz="1"/>
+              <w:bottom w:val="single" w:color="AAAAAA" w:sz="1"/>
+              <w:right w:val="single" w:color="AAAAAA" w:sz="1"/>
+            </w:tcBorders>
+            <w:tcMar>
+              <w:top w:type="dxa" w:w="60"/>
+              <w:left w:type="dxa" w:w="100"/>
+              <w:bottom w:type="dxa" w:w="60"/>
+              <w:right w:type="dxa" w:w="100"/>
+            </w:tcMar>
+          </w:tcPr>
+          <w:p>
+            <w:pPr>
+              <w:jc w:val="left"/>
+            </w:pPr>
+            <w:r>
+              <w:rPr>
+                <w:b w:val="false"/>
+                <w:bCs w:val="false"/>
+                <w:sz w:val="19"/>
+                <w:szCs w:val="19"/>
+              </w:rPr>
+              <w:t xml:space="preserve">4.46</w:t>
+            </w:r>
+          </w:p>
+        </w:tc>
+        <w:tc>
+          <w:tcPr>
+            <w:tcW w:type="dxa" w:w="1684"/>
+            <w:tcBorders>
+              <w:top w:val="single" w:color="AAAAAA" w:sz="1"/>
+              <w:left w:val="single" w:color="AAAAAA" w:sz="1"/>
+              <w:bottom w:val="single" w:color="AAAAAA" w:sz="1"/>
+              <w:right w:val="single" w:color="AAAAAA" w:sz="1"/>
+            </w:tcBorders>
+            <w:tcMar>
+              <w:top w:type="dxa" w:w="60"/>
+              <w:left w:type="dxa" w:w="100"/>
+              <w:bottom w:type="dxa" w:w="60"/>
+              <w:right w:type="dxa" w:w="100"/>
+            </w:tcMar>
+          </w:tcPr>
+          <w:p>
+            <w:pPr>
+              <w:jc w:val="left"/>
+            </w:pPr>
+            <w:r>
+              <w:rPr>
+                <w:b w:val="false"/>
+                <w:bCs w:val="false"/>
+                <w:sz w:val="19"/>
+                <w:szCs w:val="19"/>
+              </w:rPr>
+              <w:t xml:space="preserve">101.2</w:t>
+            </w:r>
+          </w:p>
+        </w:tc>
+        <w:tc>
+          <w:tcPr>
+            <w:tcW w:type="dxa" w:w="1872"/>
+            <w:tcBorders>
+              <w:top w:val="single" w:color="AAAAAA" w:sz="1"/>
+              <w:left w:val="single" w:color="AAAAAA" w:sz="1"/>
+              <w:bottom w:val="single" w:color="AAAAAA" w:sz="1"/>
+              <w:right w:val="single" w:color="AAAAAA" w:sz="1"/>
+            </w:tcBorders>
+            <w:tcMar>
+              <w:top w:type="dxa" w:w="60"/>
+              <w:left w:type="dxa" w:w="100"/>
+              <w:bottom w:type="dxa" w:w="60"/>
+              <w:right w:type="dxa" w:w="100"/>
+            </w:tcMar>
+          </w:tcPr>
+          <w:p>
+            <w:pPr>
+              <w:jc w:val="left"/>
+            </w:pPr>
+            <w:r>
+              <w:rPr>
+                <w:b w:val="false"/>
+                <w:bCs w:val="false"/>
+                <w:sz w:val="19"/>
+                <w:szCs w:val="19"/>
+              </w:rPr>
+              <w:t xml:space="preserve">2.1</w:t>
+            </w:r>
+          </w:p>
+        </w:tc>
+        <w:tc>
+          <w:tcPr>
+            <w:tcW w:type="dxa" w:w="1684"/>
+            <w:tcBorders>
+              <w:top w:val="single" w:color="AAAAAA" w:sz="1"/>
+              <w:left w:val="single" w:color="AAAAAA" w:sz="1"/>
+              <w:bottom w:val="single" w:color="AAAAAA" w:sz="1"/>
+              <w:right w:val="single" w:color="AAAAAA" w:sz="1"/>
+            </w:tcBorders>
+            <w:tcMar>
+              <w:top w:type="dxa" w:w="60"/>
+              <w:left w:type="dxa" w:w="100"/>
+              <w:bottom w:type="dxa" w:w="60"/>
+              <w:right w:type="dxa" w:w="100"/>
+            </w:tcMar>
+          </w:tcPr>
+          <w:p>
+            <w:pPr>
+              <w:jc w:val="left"/>
+            </w:pPr>
+            <w:r>
+              <w:rPr>
+                <w:b w:val="false"/>
+                <w:bCs w:val="false"/>
+                <w:sz w:val="19"/>
+                <w:szCs w:val="19"/>
+              </w:rPr>
+              <w:t xml:space="preserve">100.7</w:t>
+            </w:r>
+          </w:p>
+        </w:tc>
+      </w:tr>
+    </w:tbl>
+    <w:p>
+      <w:pPr>
+        <w:spacing w:after="120"/>
+      </w:pPr>
+      <w:r>
+        <w:t xml:space="preserve"/>
+      </w:r>
+    </w:p>
+    <w:p>
+      <w:pPr>
+        <w:spacing w:after="60" w:before="120"/>
+        <w:jc w:val="center"/>
+      </w:pPr>
+      <w:r>
+        <w:drawing>
+          <wp:inline distT="0" distB="0" distL="0" distR="0">
+            <wp:extent cx="3895725" cy="2867025"/>
+            <wp:effectExtent t="0" r="0" b="0" l="0"/>
+            <wp:docPr id="1" name="Figure 8" descr="Workshop benchmark: alpha electronic stopping vs velocity for the Stanek 2024 single-species cases (H, C, Be, Al, Cu), ready for overlay against the workshop consensus." title="Figure 8"/>
+            <wp:cNvGraphicFramePr>
+              <a:graphicFrameLocks xmlns:a="http://schemas.openxmlformats.org/drawingml/2006/main" noChangeAspect="1"/>
+            </wp:cNvGraphicFramePr>
+            <a:graphic xmlns:a="http://schemas.openxmlformats.org/drawingml/2006/main">
+              <a:graphicData uri="http://schemas.openxmlformats.org/drawingml/2006/picture">
+                <pic:pic xmlns:pic="http://schemas.openxmlformats.org/drawingml/2006/picture">
+                  <pic:nvPicPr>
+                    <pic:cNvPr id="0" name="" descr=""/>
+                    <pic:cNvPicPr>
+                      <a:picLocks noChangeAspect="1" noChangeArrowheads="1"/>
+                    </pic:cNvPicPr>
+                  </pic:nvPicPr>
+                  <pic:blipFill>
+                    <a:blip r:embed="rId15" cstate="none"/>
+                    <a:srcRect/>
+                    <a:stretch>
+                      <a:fillRect/>
+                    </a:stretch>
+                  </pic:blipFill>
+                  <pic:spPr bwMode="auto">
+                    <a:xfrm>
+                      <a:off x="0" y="0"/>
+                      <a:ext cx="3895725" cy="2867025"/>
+                    </a:xfrm>
+                    <a:prstGeom prst="rect">
+                      <a:avLst/>
+                    </a:prstGeom>
+                  </pic:spPr>
+                </pic:pic>
+              </a:graphicData>
+            </a:graphic>
+          </wp:inline>
+        </w:drawing>
+      </w:r>
+    </w:p>
+    <w:p>
+      <w:pPr>
+        <w:spacing w:after="200"/>
+        <w:jc w:val="center"/>
+      </w:pPr>
+      <w:r>
+        <w:rPr>
+          <w:b/>
+          <w:bCs/>
+          <w:sz w:val="18"/>
+          <w:szCs w:val="18"/>
+        </w:rPr>
+        <w:t xml:space="preserve">Figure 8. </w:t>
+      </w:r>
+      <w:r>
+        <w:rPr>
+          <w:sz w:val="18"/>
+          <w:szCs w:val="18"/>
+        </w:rPr>
+        <w:t xml:space="preserve">Workshop benchmark: alpha electronic stopping vs velocity for the Stanek 2024 single-species cases (H, C, Be, Al, Cu), ready for overlay against the workshop consensus.</w:t>
+      </w:r>
+    </w:p>
+    <w:p>
+      <w:pPr>
+        <w:pStyle w:val="Heading1"/>
+      </w:pPr>
+      <w:r>
+        <w:t xml:space="preserve">G. Scope and limitations</w:t>
       </w:r>
     </w:p>
     <w:p>

</xml_diff>

<commit_message>
Paper docx: regenerate with Stanek overlay, carbon AA, shell-depth (3 new figs)
Mirrors the markdown section-F additions; embeds exp_stanek.png,
exp_stanek_C_AA.png, stopping_depth.png (Figures 9-11). 12 images total,
document.xml validated well-formed.

Co-Authored-By: Claude Opus 4.8 <noreply@anthropic.com>
</commit_message>
<xml_diff>
--- a/docs/nuclear_stopping_paper_draft.docx
+++ b/docs/nuclear_stopping_paper_draft.docx
@@ -2579,6 +2579,258 @@
           <w:szCs w:val="18"/>
         </w:rPr>
         <w:t xml:space="preserve">Workshop benchmark: alpha electronic stopping vs velocity for the Stanek 2024 single-species cases (H, C, Be, Al, Cu), ready for overlay against the workshop consensus.</w:t>
+      </w:r>
+    </w:p>
+    <w:p>
+      <w:pPr>
+        <w:spacing w:after="120" w:line="276"/>
+        <w:jc w:val="both"/>
+      </w:pPr>
+      <w:r>
+        <w:rPr>
+          <w:b/>
+          <w:bCs/>
+        </w:rPr>
+        <w:t xml:space="preserve">Direct overlay on the Stanek TD-DFT-MD reference. </w:t>
+      </w:r>
+      <w:r>
+        <w:t xml:space="preserve">Overlaying the eRPA-AA electronic stopping on the Stanek 2024 Fig. 12 TD-DFT-MD points (H, C, Al) reproduces the reported average-atom behavior: the curves converge with the data beyond the stopping peak and sit above the data near and below it, by 24–55% at the peak (model/data: H 1.30, C 1.24, Al 1.55). The deviation grows with the bound-electron complement, largest for Al.</w:t>
+      </w:r>
+    </w:p>
+    <w:p>
+      <w:pPr>
+        <w:spacing w:after="60" w:before="120"/>
+        <w:jc w:val="center"/>
+      </w:pPr>
+      <w:r>
+        <w:drawing>
+          <wp:inline distT="0" distB="0" distL="0" distR="0">
+            <wp:extent cx="5905500" cy="1885950"/>
+            <wp:effectExtent t="0" r="0" b="0" l="0"/>
+            <wp:docPr id="1" name="Figure 9" descr="eRPA-AA alpha electronic stopping (this work) overlaid on the Stanek 2024 Fig. 12 TD-DFT-MD reference points for H, C, and Al." title="Figure 9"/>
+            <wp:cNvGraphicFramePr>
+              <a:graphicFrameLocks xmlns:a="http://schemas.openxmlformats.org/drawingml/2006/main" noChangeAspect="1"/>
+            </wp:cNvGraphicFramePr>
+            <a:graphic xmlns:a="http://schemas.openxmlformats.org/drawingml/2006/main">
+              <a:graphicData uri="http://schemas.openxmlformats.org/drawingml/2006/picture">
+                <pic:pic xmlns:pic="http://schemas.openxmlformats.org/drawingml/2006/picture">
+                  <pic:nvPicPr>
+                    <pic:cNvPr id="0" name="" descr=""/>
+                    <pic:cNvPicPr>
+                      <a:picLocks noChangeAspect="1" noChangeArrowheads="1"/>
+                    </pic:cNvPicPr>
+                  </pic:nvPicPr>
+                  <pic:blipFill>
+                    <a:blip r:embed="rId16" cstate="none"/>
+                    <a:srcRect/>
+                    <a:stretch>
+                      <a:fillRect/>
+                    </a:stretch>
+                  </pic:blipFill>
+                  <pic:spPr bwMode="auto">
+                    <a:xfrm>
+                      <a:off x="0" y="0"/>
+                      <a:ext cx="5905500" cy="1885950"/>
+                    </a:xfrm>
+                    <a:prstGeom prst="rect">
+                      <a:avLst/>
+                    </a:prstGeom>
+                  </pic:spPr>
+                </pic:pic>
+              </a:graphicData>
+            </a:graphic>
+          </wp:inline>
+        </w:drawing>
+      </w:r>
+    </w:p>
+    <w:p>
+      <w:pPr>
+        <w:spacing w:after="200"/>
+        <w:jc w:val="center"/>
+      </w:pPr>
+      <w:r>
+        <w:rPr>
+          <w:b/>
+          <w:bCs/>
+          <w:sz w:val="18"/>
+          <w:szCs w:val="18"/>
+        </w:rPr>
+        <w:t xml:space="preserve">Figure 9. </w:t>
+      </w:r>
+      <w:r>
+        <w:rPr>
+          <w:sz w:val="18"/>
+          <w:szCs w:val="18"/>
+        </w:rPr>
+        <w:t xml:space="preserve">eRPA-AA alpha electronic stopping (this work) overlaid on the Stanek 2024 Fig. 12 TD-DFT-MD reference points for H, C, and Al.</w:t>
+      </w:r>
+    </w:p>
+    <w:p>
+      <w:pPr>
+        <w:spacing w:after="120" w:line="276"/>
+        <w:jc w:val="both"/>
+      </w:pPr>
+      <w:r>
+        <w:rPr>
+          <w:b/>
+          <w:bCs/>
+        </w:rPr>
+        <w:t xml:space="preserve">Cross-validation against Stanek's own average-atom curves (carbon). </w:t>
+      </w:r>
+      <w:r>
+        <w:t xml:space="preserve">For carbon, Stanek Fig. 12 also reports two of Stanek's own average-atom curves. On the same axis the eRPA-AA peak (1.59×10¹⁰ eV/cm) lands between Stanek's two AA curves (1.55 and 1.67×10¹⁰), and all three average-atom models sit 21–31% above the TD-DFT-MD data at the peak. The eRPA-AA reproduces the workshop average-atom family with a somewhat broader peak; on the high-velocity tail the data fall between our model (above) and Stanek's AA (below). The AA curves were digitized against the energy-per-nucleon axis; vp = 1.389×10⁹·√(E[MeV/u]) places them on the labeled vp[cm/s] axis, reproducing the published peak position and span.</w:t>
+      </w:r>
+    </w:p>
+    <w:p>
+      <w:pPr>
+        <w:spacing w:after="60" w:before="120"/>
+        <w:jc w:val="center"/>
+      </w:pPr>
+      <w:r>
+        <w:drawing>
+          <wp:inline distT="0" distB="0" distL="0" distR="0">
+            <wp:extent cx="4248150" cy="3400425"/>
+            <wp:effectExtent t="0" r="0" b="0" l="0"/>
+            <wp:docPr id="1" name="Figure 10" descr="Carbon detail: eRPA-AA (this work) vs Stanek's two own average-atom curves and the TD-DFT-MD data, on the labeled vp[cm/s] axis." title="Figure 10"/>
+            <wp:cNvGraphicFramePr>
+              <a:graphicFrameLocks xmlns:a="http://schemas.openxmlformats.org/drawingml/2006/main" noChangeAspect="1"/>
+            </wp:cNvGraphicFramePr>
+            <a:graphic xmlns:a="http://schemas.openxmlformats.org/drawingml/2006/main">
+              <a:graphicData uri="http://schemas.openxmlformats.org/drawingml/2006/picture">
+                <pic:pic xmlns:pic="http://schemas.openxmlformats.org/drawingml/2006/picture">
+                  <pic:nvPicPr>
+                    <pic:cNvPr id="0" name="" descr=""/>
+                    <pic:cNvPicPr>
+                      <a:picLocks noChangeAspect="1" noChangeArrowheads="1"/>
+                    </pic:cNvPicPr>
+                  </pic:nvPicPr>
+                  <pic:blipFill>
+                    <a:blip r:embed="rId17" cstate="none"/>
+                    <a:srcRect/>
+                    <a:stretch>
+                      <a:fillRect/>
+                    </a:stretch>
+                  </pic:blipFill>
+                  <pic:spPr bwMode="auto">
+                    <a:xfrm>
+                      <a:off x="0" y="0"/>
+                      <a:ext cx="4248150" cy="3400425"/>
+                    </a:xfrm>
+                    <a:prstGeom prst="rect">
+                      <a:avLst/>
+                    </a:prstGeom>
+                  </pic:spPr>
+                </pic:pic>
+              </a:graphicData>
+            </a:graphic>
+          </wp:inline>
+        </w:drawing>
+      </w:r>
+    </w:p>
+    <w:p>
+      <w:pPr>
+        <w:spacing w:after="200"/>
+        <w:jc w:val="center"/>
+      </w:pPr>
+      <w:r>
+        <w:rPr>
+          <w:b/>
+          <w:bCs/>
+          <w:sz w:val="18"/>
+          <w:szCs w:val="18"/>
+        </w:rPr>
+        <w:t xml:space="preserve">Figure 10. </w:t>
+      </w:r>
+      <w:r>
+        <w:rPr>
+          <w:sz w:val="18"/>
+          <w:szCs w:val="18"/>
+        </w:rPr>
+        <w:t xml:space="preserve">Carbon detail: eRPA-AA (this work) vs Stanek's two own average-atom curves and the TD-DFT-MD data, on the labeled vp[cm/s] axis.</w:t>
+      </w:r>
+    </w:p>
+    <w:p>
+      <w:pPr>
+        <w:spacing w:after="120" w:line="276"/>
+        <w:jc w:val="both"/>
+      </w:pPr>
+      <w:r>
+        <w:rPr>
+          <w:b/>
+          <w:bCs/>
+        </w:rPr>
+        <w:t xml:space="preserve">Where the average-atom stopping comes from. </w:t>
+      </w:r>
+      <w:r>
+        <w:t xml:space="preserve">Because the eRPA-AA integrates dE/dx over the full bound+free radial density, the contribution can be decomposed by radius. TD-DFT-MD propagates the valence electrons explicitly and adds an estimated deep-core contribution, whereas the eRPA-AA includes all electrons self-consistently with DFT-like local-field corrections. For Al the median stopping depth is the loosely bound valence/conduction electrons at the Wigner–Seitz edge at low velocity (r₅₀ ≈ 2.4 a.u.) and moves steadily inward — the core re-engaging — reaching ≈1.0 a.u. only by 1 MeV/u. Throughout the Stanek velocity range (Bragg peak and above) the median depth lies in the valence/free + outer-L region, not the deep K-shell. The average-atom-vs-TD-DFT-MD difference near the peak is therefore a valence/free-electron treatment difference (local-field and exchange–correlation choices), not deep-core over-counting.</w:t>
+      </w:r>
+    </w:p>
+    <w:p>
+      <w:pPr>
+        <w:spacing w:after="60" w:before="120"/>
+        <w:jc w:val="center"/>
+      </w:pPr>
+      <w:r>
+        <w:drawing>
+          <wp:inline distT="0" distB="0" distL="0" distR="0">
+            <wp:extent cx="5905500" cy="2266950"/>
+            <wp:effectExtent t="0" r="0" b="0" l="0"/>
+            <wp:docPr id="1" name="Figure 11" descr="Shell-resolved origin of the Al eRPA-AA stopping. Left: median stopping depth vs velocity (valence-dominated at low v, moving inward as the projectile speeds up; Stanek velocity range shaded). Right: cumulative stopping fraction vs radius at several velocities." title="Figure 11"/>
+            <wp:cNvGraphicFramePr>
+              <a:graphicFrameLocks xmlns:a="http://schemas.openxmlformats.org/drawingml/2006/main" noChangeAspect="1"/>
+            </wp:cNvGraphicFramePr>
+            <a:graphic xmlns:a="http://schemas.openxmlformats.org/drawingml/2006/main">
+              <a:graphicData uri="http://schemas.openxmlformats.org/drawingml/2006/picture">
+                <pic:pic xmlns:pic="http://schemas.openxmlformats.org/drawingml/2006/picture">
+                  <pic:nvPicPr>
+                    <pic:cNvPr id="0" name="" descr=""/>
+                    <pic:cNvPicPr>
+                      <a:picLocks noChangeAspect="1" noChangeArrowheads="1"/>
+                    </pic:cNvPicPr>
+                  </pic:nvPicPr>
+                  <pic:blipFill>
+                    <a:blip r:embed="rId18" cstate="none"/>
+                    <a:srcRect/>
+                    <a:stretch>
+                      <a:fillRect/>
+                    </a:stretch>
+                  </pic:blipFill>
+                  <pic:spPr bwMode="auto">
+                    <a:xfrm>
+                      <a:off x="0" y="0"/>
+                      <a:ext cx="5905500" cy="2266950"/>
+                    </a:xfrm>
+                    <a:prstGeom prst="rect">
+                      <a:avLst/>
+                    </a:prstGeom>
+                  </pic:spPr>
+                </pic:pic>
+              </a:graphicData>
+            </a:graphic>
+          </wp:inline>
+        </w:drawing>
+      </w:r>
+    </w:p>
+    <w:p>
+      <w:pPr>
+        <w:spacing w:after="200"/>
+        <w:jc w:val="center"/>
+      </w:pPr>
+      <w:r>
+        <w:rPr>
+          <w:b/>
+          <w:bCs/>
+          <w:sz w:val="18"/>
+          <w:szCs w:val="18"/>
+        </w:rPr>
+        <w:t xml:space="preserve">Figure 11. </w:t>
+      </w:r>
+      <w:r>
+        <w:rPr>
+          <w:sz w:val="18"/>
+          <w:szCs w:val="18"/>
+        </w:rPr>
+        <w:t xml:space="preserve">Shell-resolved origin of the Al eRPA-AA stopping. Left: median stopping depth vs velocity (valence-dominated at low v, moving inward as the projectile speeds up; Stanek velocity range shaded). Right: cumulative stopping fraction vs radius at several velocities.</w:t>
       </w:r>
     </w:p>
     <w:p>

</xml_diff>

<commit_message>
Carbon AA: use vp-axis re-digitized curves (no transform); tails converge
The earlier AA-curve CSVs were digitized against Fig 12's secondary energy/u
axis (x off by the vp<->E/u sqrt relation). Re-digitized directly against the
vp[cm/s] axis: peaks now at 6.3-7.0e8 cm/s with no transform, and -- the
physical check that was previously masked -- all three average-atom high-v
tails converge on the shared Bethe limit. eRPA-AA peak still lands between
Stanek's two AA curves (1.53/1.69e10), all 19-32% above TD-DFT-MD. Dropped the
conversion caveat and the broader-peak/shallower-tail framing from the paper
(md+docx); the excess is a property of the average-atom class.

Co-Authored-By: Claude Opus 4.8 <noreply@anthropic.com>
</commit_message>
<xml_diff>
--- a/docs/nuclear_stopping_paper_draft.docx
+++ b/docs/nuclear_stopping_paper_draft.docx
@@ -2678,7 +2678,7 @@
         <w:t xml:space="preserve">Cross-validation against Stanek's own average-atom curves (carbon). </w:t>
       </w:r>
       <w:r>
-        <w:t xml:space="preserve">For carbon, Stanek Fig. 12 also reports two of Stanek's own average-atom curves. On the same axis the eRPA-AA peak (1.59×10¹⁰ eV/cm) lands between Stanek's two AA curves (1.55 and 1.67×10¹⁰), and all three average-atom models sit 21–31% above the TD-DFT-MD data at the peak. The eRPA-AA reproduces the workshop average-atom family with a somewhat broader peak; on the high-velocity tail the data fall between our model (above) and Stanek's AA (below). The AA curves were digitized against the energy-per-nucleon axis; vp = 1.389×10⁹·√(E[MeV/u]) places them on the labeled vp[cm/s] axis, reproducing the published peak position and span.</w:t>
+        <w:t xml:space="preserve">For carbon, Stanek Fig. 12 also reports two of Stanek's own average-atom curves. On the same velocity axis the eRPA-AA peak (1.59×10¹⁰ eV/cm) lands between Stanek's two AA curves (solid 1.53×10¹⁰, dot-dash 1.69×10¹⁰), and all three average-atom models sit 19–32% above the TD-DFT-MD data at the peak, with their high-velocity tails converging on the shared Bethe limit. The eRPA-AA reproduces the workshop average-atom family across the full velocity range, confirming the ~25% excess over TD-DFT-MD near the peak is a property of the average-atom treatment as a class, not of our particular implementation.</w:t>
       </w:r>
     </w:p>
     <w:p>
@@ -2691,7 +2691,7 @@
           <wp:inline distT="0" distB="0" distL="0" distR="0">
             <wp:extent cx="4248150" cy="3400425"/>
             <wp:effectExtent t="0" r="0" b="0" l="0"/>
-            <wp:docPr id="1" name="Figure 10" descr="Carbon detail: eRPA-AA (this work) vs Stanek's two own average-atom curves and the TD-DFT-MD data, on the labeled vp[cm/s] axis." title="Figure 10"/>
+            <wp:docPr id="1" name="Figure 10" descr="Carbon detail: eRPA-AA (this work) vs Stanek's two own average-atom curves and the TD-DFT-MD data, all on the figure's vp[cm/s] axis (no transform)." title="Figure 10"/>
             <wp:cNvGraphicFramePr>
               <a:graphicFrameLocks xmlns:a="http://schemas.openxmlformats.org/drawingml/2006/main" noChangeAspect="1"/>
             </wp:cNvGraphicFramePr>
@@ -2746,7 +2746,7 @@
           <w:sz w:val="18"/>
           <w:szCs w:val="18"/>
         </w:rPr>
-        <w:t xml:space="preserve">Carbon detail: eRPA-AA (this work) vs Stanek's two own average-atom curves and the TD-DFT-MD data, on the labeled vp[cm/s] axis.</w:t>
+        <w:t xml:space="preserve">Carbon detail: eRPA-AA (this work) vs Stanek's two own average-atom curves and the TD-DFT-MD data, all on the figure's vp[cm/s] axis (no transform).</w:t>
       </w:r>
     </w:p>
     <w:p>

</xml_diff>

<commit_message>
Nuclear draft: add proton-range-vs-PSTAR verification (Fig range_nuc)
Sync with the master PoP paper addition: Section D now reports that PSTAR
CSDA range (which includes nuclear) is a parameter-free total-model test --
electronic-only range overshoots by +66/+30/+23/+6% (C/Al/Ag/Au at 1 keV),
and the GK nuclear term brings C/Al/Ag to within a few % (Au overcorrects
~10%, frozen-density over-repulsion). Added Fig range_nuc to Section G and
the docx (now 13 figures).

Co-Authored-By: Claude Opus 4.8 <noreply@anthropic.com>
</commit_message>
<xml_diff>
--- a/docs/nuclear_stopping_paper_draft.docx
+++ b/docs/nuclear_stopping_paper_draft.docx
@@ -2831,6 +2831,90 @@
           <w:szCs w:val="18"/>
         </w:rPr>
         <w:t xml:space="preserve">Shell-resolved origin of the Al eRPA-AA stopping. Left: median stopping depth vs velocity (valence-dominated at low v, moving inward as the projectile speeds up; Stanek velocity range shaded). Right: cumulative stopping fraction vs radius at several velocities.</w:t>
+      </w:r>
+    </w:p>
+    <w:p>
+      <w:pPr>
+        <w:spacing w:after="120" w:line="276"/>
+        <w:jc w:val="both"/>
+      </w:pPr>
+      <w:r>
+        <w:rPr>
+          <w:b/>
+          <w:bCs/>
+        </w:rPr>
+        <w:t xml:space="preserve">Proton range vs PSTAR (Fig. 12). </w:t>
+      </w:r>
+      <w:r>
+        <w:t xml:space="preserve">Because the PSTAR CSDA range includes nuclear stopping, it is a parameter-free cold-target test of the total (electronic + nuclear) model. For protons in C, Al, Ag, and Au the electronic-only range overshoots the PSTAR CSDA range at the lowest energies — by +66% (C), +30% (Al), +23% (Ag), and +6% (Au) at 1 keV — because the nuclear channel is absent. Adding the Gordon–Kim nuclear term brings C, Al, and Ag into agreement with PSTAR to within a few percent, and slightly overcorrects gold (≈ −10%), the same frozen-density over-repulsion seen in the cold-Al nuclear comparison (Fig. 1). This is an independent confirmation that the nuclear contribution carries the correct magnitude and energy dependence at the level that controls ranges.</w:t>
+      </w:r>
+    </w:p>
+    <w:p>
+      <w:pPr>
+        <w:spacing w:after="60" w:before="120"/>
+        <w:jc w:val="center"/>
+      </w:pPr>
+      <w:r>
+        <w:drawing>
+          <wp:inline distT="0" distB="0" distL="0" distR="0">
+            <wp:extent cx="4610100" cy="3571875"/>
+            <wp:effectExtent t="0" r="0" b="0" l="0"/>
+            <wp:docPr id="1" name="Figure 12" descr="Proton range relative to the PSTAR CSDA range for C, Al, Ag, and Au: electronic-only (dashed) versus electronic + Gordon–Kim nuclear (solid). The nuclear term removes the low-energy overshoot of the electronic-only range." title="Figure 12"/>
+            <wp:cNvGraphicFramePr>
+              <a:graphicFrameLocks xmlns:a="http://schemas.openxmlformats.org/drawingml/2006/main" noChangeAspect="1"/>
+            </wp:cNvGraphicFramePr>
+            <a:graphic xmlns:a="http://schemas.openxmlformats.org/drawingml/2006/main">
+              <a:graphicData uri="http://schemas.openxmlformats.org/drawingml/2006/picture">
+                <pic:pic xmlns:pic="http://schemas.openxmlformats.org/drawingml/2006/picture">
+                  <pic:nvPicPr>
+                    <pic:cNvPr id="0" name="" descr=""/>
+                    <pic:cNvPicPr>
+                      <a:picLocks noChangeAspect="1" noChangeArrowheads="1"/>
+                    </pic:cNvPicPr>
+                  </pic:nvPicPr>
+                  <pic:blipFill>
+                    <a:blip r:embed="rId19" cstate="none"/>
+                    <a:srcRect/>
+                    <a:stretch>
+                      <a:fillRect/>
+                    </a:stretch>
+                  </pic:blipFill>
+                  <pic:spPr bwMode="auto">
+                    <a:xfrm>
+                      <a:off x="0" y="0"/>
+                      <a:ext cx="4610100" cy="3571875"/>
+                    </a:xfrm>
+                    <a:prstGeom prst="rect">
+                      <a:avLst/>
+                    </a:prstGeom>
+                  </pic:spPr>
+                </pic:pic>
+              </a:graphicData>
+            </a:graphic>
+          </wp:inline>
+        </w:drawing>
+      </w:r>
+    </w:p>
+    <w:p>
+      <w:pPr>
+        <w:spacing w:after="200"/>
+        <w:jc w:val="center"/>
+      </w:pPr>
+      <w:r>
+        <w:rPr>
+          <w:b/>
+          <w:bCs/>
+          <w:sz w:val="18"/>
+          <w:szCs w:val="18"/>
+        </w:rPr>
+        <w:t xml:space="preserve">Figure 12. </w:t>
+      </w:r>
+      <w:r>
+        <w:rPr>
+          <w:sz w:val="18"/>
+          <w:szCs w:val="18"/>
+        </w:rPr>
+        <w:t xml:space="preserve">Proton range relative to the PSTAR CSDA range for C, Al, Ag, and Au: electronic-only (dashed) versus electronic + Gordon–Kim nuclear (solid). The nuclear term removes the low-energy overshoot of the electronic-only range.</w:t>
       </w:r>
     </w:p>
     <w:p>

</xml_diff>